<commit_message>
i add new file
</commit_message>
<xml_diff>
--- a/Thesis_FINAL_COMPLETE.docx
+++ b/Thesis_FINAL_COMPLETE.docx
@@ -1542,6 +1542,15 @@
           <w:szCs w:val="22"/>
         </w:rPr>
         <w:tab/>
+      </w:r>
+      <w:r>
+        <w:rPr>
+          <w:rFonts w:ascii="Times New Roman" w:hAnsi="Times New Roman" w:eastAsia="Times New Roman" w:cs="Times New Roman"/>
+          <w:b/>
+          <w:bCs/>
+          <w:sz w:val="22"/>
+          <w:szCs w:val="22"/>
+        </w:rPr>
         <w:t>ii</w:t>
       </w:r>
     </w:p>
@@ -1572,6 +1581,15 @@
           <w:szCs w:val="22"/>
         </w:rPr>
         <w:tab/>
+      </w:r>
+      <w:r>
+        <w:rPr>
+          <w:rFonts w:ascii="Times New Roman" w:hAnsi="Times New Roman" w:eastAsia="Times New Roman" w:cs="Times New Roman"/>
+          <w:b/>
+          <w:bCs/>
+          <w:sz w:val="22"/>
+          <w:szCs w:val="22"/>
+        </w:rPr>
         <w:t>iii</w:t>
       </w:r>
     </w:p>
@@ -1602,6 +1620,15 @@
           <w:szCs w:val="22"/>
         </w:rPr>
         <w:tab/>
+      </w:r>
+      <w:r>
+        <w:rPr>
+          <w:rFonts w:ascii="Times New Roman" w:hAnsi="Times New Roman" w:eastAsia="Times New Roman" w:cs="Times New Roman"/>
+          <w:b/>
+          <w:bCs/>
+          <w:sz w:val="22"/>
+          <w:szCs w:val="22"/>
+        </w:rPr>
         <w:t>iv</w:t>
       </w:r>
     </w:p>
@@ -1632,6 +1659,15 @@
           <w:szCs w:val="22"/>
         </w:rPr>
         <w:tab/>
+      </w:r>
+      <w:r>
+        <w:rPr>
+          <w:rFonts w:ascii="Times New Roman" w:hAnsi="Times New Roman" w:eastAsia="Times New Roman" w:cs="Times New Roman"/>
+          <w:b/>
+          <w:bCs/>
+          <w:sz w:val="22"/>
+          <w:szCs w:val="22"/>
+        </w:rPr>
         <w:t>v</w:t>
       </w:r>
     </w:p>
@@ -1662,6 +1698,15 @@
           <w:szCs w:val="22"/>
         </w:rPr>
         <w:tab/>
+      </w:r>
+      <w:r>
+        <w:rPr>
+          <w:rFonts w:ascii="Times New Roman" w:hAnsi="Times New Roman" w:eastAsia="Times New Roman" w:cs="Times New Roman"/>
+          <w:b/>
+          <w:bCs/>
+          <w:sz w:val="22"/>
+          <w:szCs w:val="22"/>
+        </w:rPr>
         <w:t>vi</w:t>
       </w:r>
     </w:p>
@@ -1692,6 +1737,15 @@
           <w:szCs w:val="22"/>
         </w:rPr>
         <w:tab/>
+      </w:r>
+      <w:r>
+        <w:rPr>
+          <w:rFonts w:ascii="Times New Roman" w:hAnsi="Times New Roman" w:eastAsia="Times New Roman" w:cs="Times New Roman"/>
+          <w:b/>
+          <w:bCs/>
+          <w:sz w:val="22"/>
+          <w:szCs w:val="22"/>
+        </w:rPr>
         <w:t>vii</w:t>
       </w:r>
     </w:p>
@@ -1722,6 +1776,15 @@
           <w:szCs w:val="22"/>
         </w:rPr>
         <w:tab/>
+      </w:r>
+      <w:r>
+        <w:rPr>
+          <w:rFonts w:ascii="Times New Roman" w:hAnsi="Times New Roman" w:eastAsia="Times New Roman" w:cs="Times New Roman"/>
+          <w:b/>
+          <w:bCs/>
+          <w:sz w:val="22"/>
+          <w:szCs w:val="22"/>
+        </w:rPr>
         <w:t>viii</w:t>
       </w:r>
     </w:p>
@@ -1752,6 +1815,15 @@
           <w:szCs w:val="22"/>
         </w:rPr>
         <w:tab/>
+      </w:r>
+      <w:r>
+        <w:rPr>
+          <w:rFonts w:ascii="Times New Roman" w:hAnsi="Times New Roman" w:eastAsia="Times New Roman" w:cs="Times New Roman"/>
+          <w:b/>
+          <w:bCs/>
+          <w:sz w:val="22"/>
+          <w:szCs w:val="22"/>
+        </w:rPr>
         <w:t>x</w:t>
       </w:r>
     </w:p>
@@ -1782,6 +1854,15 @@
           <w:szCs w:val="22"/>
         </w:rPr>
         <w:tab/>
+      </w:r>
+      <w:r>
+        <w:rPr>
+          <w:rFonts w:ascii="Times New Roman" w:hAnsi="Times New Roman" w:eastAsia="Times New Roman" w:cs="Times New Roman"/>
+          <w:b/>
+          <w:bCs/>
+          <w:sz w:val="22"/>
+          <w:szCs w:val="22"/>
+        </w:rPr>
         <w:t>xi</w:t>
       </w:r>
     </w:p>
@@ -1812,6 +1893,15 @@
           <w:szCs w:val="22"/>
         </w:rPr>
         <w:tab/>
+      </w:r>
+      <w:r>
+        <w:rPr>
+          <w:rFonts w:ascii="Times New Roman" w:hAnsi="Times New Roman" w:eastAsia="Times New Roman" w:cs="Times New Roman"/>
+          <w:b/>
+          <w:bCs/>
+          <w:sz w:val="22"/>
+          <w:szCs w:val="22"/>
+        </w:rPr>
         <w:t>xii</w:t>
       </w:r>
     </w:p>
@@ -1847,6 +1937,15 @@
           <w:szCs w:val="22"/>
         </w:rPr>
         <w:tab/>
+      </w:r>
+      <w:r>
+        <w:rPr>
+          <w:rFonts w:ascii="Times New Roman" w:hAnsi="Times New Roman" w:eastAsia="Times New Roman" w:cs="Times New Roman"/>
+          <w:b/>
+          <w:bCs/>
+          <w:sz w:val="22"/>
+          <w:szCs w:val="22"/>
+        </w:rPr>
         <w:t>1</w:t>
       </w:r>
     </w:p>
@@ -1877,6 +1976,15 @@
           <w:szCs w:val="22"/>
         </w:rPr>
         <w:tab/>
+      </w:r>
+      <w:r>
+        <w:rPr>
+          <w:rFonts w:ascii="Times New Roman" w:hAnsi="Times New Roman" w:eastAsia="Times New Roman" w:cs="Times New Roman"/>
+          <w:b w:val="0"/>
+          <w:bCs w:val="0"/>
+          <w:sz w:val="22"/>
+          <w:szCs w:val="22"/>
+        </w:rPr>
         <w:t>1</w:t>
       </w:r>
     </w:p>
@@ -1907,6 +2015,15 @@
           <w:szCs w:val="22"/>
         </w:rPr>
         <w:tab/>
+      </w:r>
+      <w:r>
+        <w:rPr>
+          <w:rFonts w:ascii="Times New Roman" w:hAnsi="Times New Roman" w:eastAsia="Times New Roman" w:cs="Times New Roman"/>
+          <w:b w:val="0"/>
+          <w:bCs w:val="0"/>
+          <w:sz w:val="22"/>
+          <w:szCs w:val="22"/>
+        </w:rPr>
         <w:t>2</w:t>
       </w:r>
     </w:p>
@@ -1937,6 +2054,15 @@
           <w:szCs w:val="22"/>
         </w:rPr>
         <w:tab/>
+      </w:r>
+      <w:r>
+        <w:rPr>
+          <w:rFonts w:ascii="Times New Roman" w:hAnsi="Times New Roman" w:eastAsia="Times New Roman" w:cs="Times New Roman"/>
+          <w:b w:val="0"/>
+          <w:bCs w:val="0"/>
+          <w:sz w:val="22"/>
+          <w:szCs w:val="22"/>
+        </w:rPr>
         <w:t>2</w:t>
       </w:r>
     </w:p>
@@ -1967,6 +2093,15 @@
           <w:szCs w:val="22"/>
         </w:rPr>
         <w:tab/>
+      </w:r>
+      <w:r>
+        <w:rPr>
+          <w:rFonts w:ascii="Times New Roman" w:hAnsi="Times New Roman" w:eastAsia="Times New Roman" w:cs="Times New Roman"/>
+          <w:b w:val="0"/>
+          <w:bCs w:val="0"/>
+          <w:sz w:val="22"/>
+          <w:szCs w:val="22"/>
+        </w:rPr>
         <w:t>3</w:t>
       </w:r>
     </w:p>
@@ -1997,6 +2132,15 @@
           <w:szCs w:val="22"/>
         </w:rPr>
         <w:tab/>
+      </w:r>
+      <w:r>
+        <w:rPr>
+          <w:rFonts w:ascii="Times New Roman" w:hAnsi="Times New Roman" w:eastAsia="Times New Roman" w:cs="Times New Roman"/>
+          <w:b w:val="0"/>
+          <w:bCs w:val="0"/>
+          <w:sz w:val="22"/>
+          <w:szCs w:val="22"/>
+        </w:rPr>
         <w:t>3</w:t>
       </w:r>
     </w:p>
@@ -2027,6 +2171,15 @@
           <w:szCs w:val="22"/>
         </w:rPr>
         <w:tab/>
+      </w:r>
+      <w:r>
+        <w:rPr>
+          <w:rFonts w:ascii="Times New Roman" w:hAnsi="Times New Roman" w:eastAsia="Times New Roman" w:cs="Times New Roman"/>
+          <w:b/>
+          <w:bCs/>
+          <w:sz w:val="22"/>
+          <w:szCs w:val="22"/>
+        </w:rPr>
         <w:t>4</w:t>
       </w:r>
     </w:p>
@@ -2057,6 +2210,15 @@
           <w:szCs w:val="22"/>
         </w:rPr>
         <w:tab/>
+      </w:r>
+      <w:r>
+        <w:rPr>
+          <w:rFonts w:ascii="Times New Roman" w:hAnsi="Times New Roman" w:eastAsia="Times New Roman" w:cs="Times New Roman"/>
+          <w:b w:val="0"/>
+          <w:bCs w:val="0"/>
+          <w:sz w:val="22"/>
+          <w:szCs w:val="22"/>
+        </w:rPr>
         <w:t>4</w:t>
       </w:r>
     </w:p>
@@ -2087,6 +2249,15 @@
           <w:szCs w:val="22"/>
         </w:rPr>
         <w:tab/>
+      </w:r>
+      <w:r>
+        <w:rPr>
+          <w:rFonts w:ascii="Times New Roman" w:hAnsi="Times New Roman" w:eastAsia="Times New Roman" w:cs="Times New Roman"/>
+          <w:b w:val="0"/>
+          <w:bCs w:val="0"/>
+          <w:sz w:val="22"/>
+          <w:szCs w:val="22"/>
+        </w:rPr>
         <w:t>5</w:t>
       </w:r>
     </w:p>
@@ -2117,6 +2288,15 @@
           <w:szCs w:val="22"/>
         </w:rPr>
         <w:tab/>
+      </w:r>
+      <w:r>
+        <w:rPr>
+          <w:rFonts w:ascii="Times New Roman" w:hAnsi="Times New Roman" w:eastAsia="Times New Roman" w:cs="Times New Roman"/>
+          <w:b w:val="0"/>
+          <w:bCs w:val="0"/>
+          <w:sz w:val="22"/>
+          <w:szCs w:val="22"/>
+        </w:rPr>
         <w:t>7</w:t>
       </w:r>
     </w:p>
@@ -2147,6 +2327,15 @@
           <w:szCs w:val="22"/>
         </w:rPr>
         <w:tab/>
+      </w:r>
+      <w:r>
+        <w:rPr>
+          <w:rFonts w:ascii="Times New Roman" w:hAnsi="Times New Roman" w:eastAsia="Times New Roman" w:cs="Times New Roman"/>
+          <w:b w:val="0"/>
+          <w:bCs w:val="0"/>
+          <w:sz w:val="22"/>
+          <w:szCs w:val="22"/>
+        </w:rPr>
         <w:t>7</w:t>
       </w:r>
     </w:p>
@@ -2177,6 +2366,15 @@
           <w:szCs w:val="22"/>
         </w:rPr>
         <w:tab/>
+      </w:r>
+      <w:r>
+        <w:rPr>
+          <w:rFonts w:ascii="Times New Roman" w:hAnsi="Times New Roman" w:eastAsia="Times New Roman" w:cs="Times New Roman"/>
+          <w:b/>
+          <w:bCs/>
+          <w:sz w:val="22"/>
+          <w:szCs w:val="22"/>
+        </w:rPr>
         <w:t>8</w:t>
       </w:r>
     </w:p>
@@ -2207,6 +2405,15 @@
           <w:szCs w:val="22"/>
         </w:rPr>
         <w:tab/>
+      </w:r>
+      <w:r>
+        <w:rPr>
+          <w:rFonts w:ascii="Times New Roman" w:hAnsi="Times New Roman" w:eastAsia="Times New Roman" w:cs="Times New Roman"/>
+          <w:b w:val="0"/>
+          <w:bCs w:val="0"/>
+          <w:sz w:val="22"/>
+          <w:szCs w:val="22"/>
+        </w:rPr>
         <w:t>8</w:t>
       </w:r>
     </w:p>
@@ -2237,6 +2444,15 @@
           <w:szCs w:val="22"/>
         </w:rPr>
         <w:tab/>
+      </w:r>
+      <w:r>
+        <w:rPr>
+          <w:rFonts w:ascii="Times New Roman" w:hAnsi="Times New Roman" w:eastAsia="Times New Roman" w:cs="Times New Roman"/>
+          <w:b w:val="0"/>
+          <w:bCs w:val="0"/>
+          <w:sz w:val="22"/>
+          <w:szCs w:val="22"/>
+        </w:rPr>
         <w:t>8</w:t>
       </w:r>
     </w:p>
@@ -2267,6 +2483,15 @@
           <w:szCs w:val="22"/>
         </w:rPr>
         <w:tab/>
+      </w:r>
+      <w:r>
+        <w:rPr>
+          <w:rFonts w:ascii="Times New Roman" w:hAnsi="Times New Roman" w:eastAsia="Times New Roman" w:cs="Times New Roman"/>
+          <w:b w:val="0"/>
+          <w:bCs w:val="0"/>
+          <w:sz w:val="22"/>
+          <w:szCs w:val="22"/>
+        </w:rPr>
         <w:t>9</w:t>
       </w:r>
     </w:p>
@@ -2297,6 +2522,15 @@
           <w:szCs w:val="22"/>
         </w:rPr>
         <w:tab/>
+      </w:r>
+      <w:r>
+        <w:rPr>
+          <w:rFonts w:ascii="Times New Roman" w:hAnsi="Times New Roman" w:eastAsia="Times New Roman" w:cs="Times New Roman"/>
+          <w:b w:val="0"/>
+          <w:bCs w:val="0"/>
+          <w:sz w:val="22"/>
+          <w:szCs w:val="22"/>
+        </w:rPr>
         <w:t>11</w:t>
       </w:r>
     </w:p>
@@ -2327,6 +2561,15 @@
           <w:szCs w:val="22"/>
         </w:rPr>
         <w:tab/>
+      </w:r>
+      <w:r>
+        <w:rPr>
+          <w:rFonts w:ascii="Times New Roman" w:hAnsi="Times New Roman" w:eastAsia="Times New Roman" w:cs="Times New Roman"/>
+          <w:b/>
+          <w:bCs/>
+          <w:sz w:val="22"/>
+          <w:szCs w:val="22"/>
+        </w:rPr>
         <w:t>12</w:t>
       </w:r>
     </w:p>
@@ -2357,6 +2600,15 @@
           <w:szCs w:val="22"/>
         </w:rPr>
         <w:tab/>
+      </w:r>
+      <w:r>
+        <w:rPr>
+          <w:rFonts w:ascii="Times New Roman" w:hAnsi="Times New Roman" w:eastAsia="Times New Roman" w:cs="Times New Roman"/>
+          <w:b w:val="0"/>
+          <w:bCs w:val="0"/>
+          <w:sz w:val="22"/>
+          <w:szCs w:val="22"/>
+        </w:rPr>
         <w:t>12</w:t>
       </w:r>
     </w:p>
@@ -2387,6 +2639,15 @@
           <w:szCs w:val="22"/>
         </w:rPr>
         <w:tab/>
+      </w:r>
+      <w:r>
+        <w:rPr>
+          <w:rFonts w:ascii="Times New Roman" w:hAnsi="Times New Roman" w:eastAsia="Times New Roman" w:cs="Times New Roman"/>
+          <w:b w:val="0"/>
+          <w:bCs w:val="0"/>
+          <w:sz w:val="22"/>
+          <w:szCs w:val="22"/>
+        </w:rPr>
         <w:t>13</w:t>
       </w:r>
     </w:p>
@@ -2417,6 +2678,15 @@
           <w:szCs w:val="22"/>
         </w:rPr>
         <w:tab/>
+      </w:r>
+      <w:r>
+        <w:rPr>
+          <w:rFonts w:ascii="Times New Roman" w:hAnsi="Times New Roman" w:eastAsia="Times New Roman" w:cs="Times New Roman"/>
+          <w:b w:val="0"/>
+          <w:bCs w:val="0"/>
+          <w:sz w:val="22"/>
+          <w:szCs w:val="22"/>
+        </w:rPr>
         <w:t>15</w:t>
       </w:r>
     </w:p>
@@ -2447,6 +2717,15 @@
           <w:szCs w:val="22"/>
         </w:rPr>
         <w:tab/>
+      </w:r>
+      <w:r>
+        <w:rPr>
+          <w:rFonts w:ascii="Times New Roman" w:hAnsi="Times New Roman" w:eastAsia="Times New Roman" w:cs="Times New Roman"/>
+          <w:b w:val="0"/>
+          <w:bCs w:val="0"/>
+          <w:sz w:val="22"/>
+          <w:szCs w:val="22"/>
+        </w:rPr>
         <w:t>15</w:t>
       </w:r>
     </w:p>
@@ -2477,6 +2756,15 @@
           <w:szCs w:val="22"/>
         </w:rPr>
         <w:tab/>
+      </w:r>
+      <w:r>
+        <w:rPr>
+          <w:rFonts w:ascii="Times New Roman" w:hAnsi="Times New Roman" w:eastAsia="Times New Roman" w:cs="Times New Roman"/>
+          <w:b/>
+          <w:bCs/>
+          <w:sz w:val="22"/>
+          <w:szCs w:val="22"/>
+        </w:rPr>
         <w:t>16</w:t>
       </w:r>
     </w:p>
@@ -2507,6 +2795,15 @@
           <w:szCs w:val="22"/>
         </w:rPr>
         <w:tab/>
+      </w:r>
+      <w:r>
+        <w:rPr>
+          <w:rFonts w:ascii="Times New Roman" w:hAnsi="Times New Roman" w:eastAsia="Times New Roman" w:cs="Times New Roman"/>
+          <w:b w:val="0"/>
+          <w:bCs w:val="0"/>
+          <w:sz w:val="22"/>
+          <w:szCs w:val="22"/>
+        </w:rPr>
         <w:t>16</w:t>
       </w:r>
     </w:p>
@@ -2537,6 +2834,15 @@
           <w:szCs w:val="22"/>
         </w:rPr>
         <w:tab/>
+      </w:r>
+      <w:r>
+        <w:rPr>
+          <w:rFonts w:ascii="Times New Roman" w:hAnsi="Times New Roman" w:eastAsia="Times New Roman" w:cs="Times New Roman"/>
+          <w:b w:val="0"/>
+          <w:bCs w:val="0"/>
+          <w:sz w:val="22"/>
+          <w:szCs w:val="22"/>
+        </w:rPr>
         <w:t>17</w:t>
       </w:r>
     </w:p>
@@ -2567,6 +2873,15 @@
           <w:szCs w:val="22"/>
         </w:rPr>
         <w:tab/>
+      </w:r>
+      <w:r>
+        <w:rPr>
+          <w:rFonts w:ascii="Times New Roman" w:hAnsi="Times New Roman" w:eastAsia="Times New Roman" w:cs="Times New Roman"/>
+          <w:b w:val="0"/>
+          <w:bCs w:val="0"/>
+          <w:sz w:val="22"/>
+          <w:szCs w:val="22"/>
+        </w:rPr>
         <w:t>17</w:t>
       </w:r>
     </w:p>
@@ -2597,6 +2912,15 @@
           <w:szCs w:val="22"/>
         </w:rPr>
         <w:tab/>
+      </w:r>
+      <w:r>
+        <w:rPr>
+          <w:rFonts w:ascii="Times New Roman" w:hAnsi="Times New Roman" w:eastAsia="Times New Roman" w:cs="Times New Roman"/>
+          <w:b w:val="0"/>
+          <w:bCs w:val="0"/>
+          <w:sz w:val="22"/>
+          <w:szCs w:val="22"/>
+        </w:rPr>
         <w:t>18</w:t>
       </w:r>
     </w:p>
@@ -2627,6 +2951,15 @@
           <w:szCs w:val="22"/>
         </w:rPr>
         <w:tab/>
+      </w:r>
+      <w:r>
+        <w:rPr>
+          <w:rFonts w:ascii="Times New Roman" w:hAnsi="Times New Roman" w:eastAsia="Times New Roman" w:cs="Times New Roman"/>
+          <w:b w:val="0"/>
+          <w:bCs w:val="0"/>
+          <w:sz w:val="22"/>
+          <w:szCs w:val="22"/>
+        </w:rPr>
         <w:t>19</w:t>
       </w:r>
     </w:p>
@@ -2657,6 +2990,15 @@
           <w:szCs w:val="22"/>
         </w:rPr>
         <w:tab/>
+      </w:r>
+      <w:r>
+        <w:rPr>
+          <w:rFonts w:ascii="Times New Roman" w:hAnsi="Times New Roman" w:eastAsia="Times New Roman" w:cs="Times New Roman"/>
+          <w:b w:val="0"/>
+          <w:bCs w:val="0"/>
+          <w:sz w:val="22"/>
+          <w:szCs w:val="22"/>
+        </w:rPr>
         <w:t>19</w:t>
       </w:r>
     </w:p>
@@ -2687,6 +3029,15 @@
           <w:szCs w:val="22"/>
         </w:rPr>
         <w:tab/>
+      </w:r>
+      <w:r>
+        <w:rPr>
+          <w:rFonts w:ascii="Times New Roman" w:hAnsi="Times New Roman" w:eastAsia="Times New Roman" w:cs="Times New Roman"/>
+          <w:b w:val="0"/>
+          <w:bCs w:val="0"/>
+          <w:sz w:val="22"/>
+          <w:szCs w:val="22"/>
+        </w:rPr>
         <w:t>20</w:t>
       </w:r>
     </w:p>
@@ -2717,6 +3068,15 @@
           <w:szCs w:val="22"/>
         </w:rPr>
         <w:tab/>
+      </w:r>
+      <w:r>
+        <w:rPr>
+          <w:rFonts w:ascii="Times New Roman" w:hAnsi="Times New Roman" w:eastAsia="Times New Roman" w:cs="Times New Roman"/>
+          <w:b/>
+          <w:bCs/>
+          <w:sz w:val="22"/>
+          <w:szCs w:val="22"/>
+        </w:rPr>
         <w:t>21</w:t>
       </w:r>
     </w:p>
@@ -2747,6 +3107,15 @@
           <w:szCs w:val="22"/>
         </w:rPr>
         <w:tab/>
+      </w:r>
+      <w:r>
+        <w:rPr>
+          <w:rFonts w:ascii="Times New Roman" w:hAnsi="Times New Roman" w:eastAsia="Times New Roman" w:cs="Times New Roman"/>
+          <w:b w:val="0"/>
+          <w:bCs w:val="0"/>
+          <w:sz w:val="22"/>
+          <w:szCs w:val="22"/>
+        </w:rPr>
         <w:t>21</w:t>
       </w:r>
     </w:p>
@@ -2777,6 +3146,15 @@
           <w:szCs w:val="22"/>
         </w:rPr>
         <w:tab/>
+      </w:r>
+      <w:r>
+        <w:rPr>
+          <w:rFonts w:ascii="Times New Roman" w:hAnsi="Times New Roman" w:eastAsia="Times New Roman" w:cs="Times New Roman"/>
+          <w:b w:val="0"/>
+          <w:bCs w:val="0"/>
+          <w:sz w:val="22"/>
+          <w:szCs w:val="22"/>
+        </w:rPr>
         <w:t>21</w:t>
       </w:r>
     </w:p>
@@ -2807,6 +3185,15 @@
           <w:szCs w:val="22"/>
         </w:rPr>
         <w:tab/>
+      </w:r>
+      <w:r>
+        <w:rPr>
+          <w:rFonts w:ascii="Times New Roman" w:hAnsi="Times New Roman" w:eastAsia="Times New Roman" w:cs="Times New Roman"/>
+          <w:b w:val="0"/>
+          <w:bCs w:val="0"/>
+          <w:sz w:val="22"/>
+          <w:szCs w:val="22"/>
+        </w:rPr>
         <w:t>22</w:t>
       </w:r>
     </w:p>
@@ -2837,6 +3224,15 @@
           <w:szCs w:val="22"/>
         </w:rPr>
         <w:tab/>
+      </w:r>
+      <w:r>
+        <w:rPr>
+          <w:rFonts w:ascii="Times New Roman" w:hAnsi="Times New Roman" w:eastAsia="Times New Roman" w:cs="Times New Roman"/>
+          <w:b w:val="0"/>
+          <w:bCs w:val="0"/>
+          <w:sz w:val="22"/>
+          <w:szCs w:val="22"/>
+        </w:rPr>
         <w:t>23</w:t>
       </w:r>
     </w:p>
@@ -2867,6 +3263,15 @@
           <w:szCs w:val="22"/>
         </w:rPr>
         <w:tab/>
+      </w:r>
+      <w:r>
+        <w:rPr>
+          <w:rFonts w:ascii="Times New Roman" w:hAnsi="Times New Roman" w:eastAsia="Times New Roman" w:cs="Times New Roman"/>
+          <w:b w:val="0"/>
+          <w:bCs w:val="0"/>
+          <w:sz w:val="22"/>
+          <w:szCs w:val="22"/>
+        </w:rPr>
         <w:t>23</w:t>
       </w:r>
     </w:p>
@@ -2897,6 +3302,15 @@
           <w:szCs w:val="22"/>
         </w:rPr>
         <w:tab/>
+      </w:r>
+      <w:r>
+        <w:rPr>
+          <w:rFonts w:ascii="Times New Roman" w:hAnsi="Times New Roman" w:eastAsia="Times New Roman" w:cs="Times New Roman"/>
+          <w:b/>
+          <w:bCs/>
+          <w:sz w:val="22"/>
+          <w:szCs w:val="22"/>
+        </w:rPr>
         <w:t>24</w:t>
       </w:r>
     </w:p>
@@ -2927,6 +3341,15 @@
           <w:szCs w:val="22"/>
         </w:rPr>
         <w:tab/>
+      </w:r>
+      <w:r>
+        <w:rPr>
+          <w:rFonts w:ascii="Times New Roman" w:hAnsi="Times New Roman" w:eastAsia="Times New Roman" w:cs="Times New Roman"/>
+          <w:b w:val="0"/>
+          <w:bCs w:val="0"/>
+          <w:sz w:val="22"/>
+          <w:szCs w:val="22"/>
+        </w:rPr>
         <w:t>24</w:t>
       </w:r>
     </w:p>
@@ -2957,6 +3380,15 @@
           <w:szCs w:val="22"/>
         </w:rPr>
         <w:tab/>
+      </w:r>
+      <w:r>
+        <w:rPr>
+          <w:rFonts w:ascii="Times New Roman" w:hAnsi="Times New Roman" w:eastAsia="Times New Roman" w:cs="Times New Roman"/>
+          <w:b w:val="0"/>
+          <w:bCs w:val="0"/>
+          <w:sz w:val="22"/>
+          <w:szCs w:val="22"/>
+        </w:rPr>
         <w:t>24</w:t>
       </w:r>
     </w:p>
@@ -2987,6 +3419,15 @@
           <w:szCs w:val="22"/>
         </w:rPr>
         <w:tab/>
+      </w:r>
+      <w:r>
+        <w:rPr>
+          <w:rFonts w:ascii="Times New Roman" w:hAnsi="Times New Roman" w:eastAsia="Times New Roman" w:cs="Times New Roman"/>
+          <w:b w:val="0"/>
+          <w:bCs w:val="0"/>
+          <w:sz w:val="22"/>
+          <w:szCs w:val="22"/>
+        </w:rPr>
         <w:t>25</w:t>
       </w:r>
     </w:p>
@@ -3017,6 +3458,15 @@
           <w:szCs w:val="22"/>
         </w:rPr>
         <w:tab/>
+      </w:r>
+      <w:r>
+        <w:rPr>
+          <w:rFonts w:ascii="Times New Roman" w:hAnsi="Times New Roman" w:eastAsia="Times New Roman" w:cs="Times New Roman"/>
+          <w:b w:val="0"/>
+          <w:bCs w:val="0"/>
+          <w:sz w:val="22"/>
+          <w:szCs w:val="22"/>
+        </w:rPr>
         <w:t>26</w:t>
       </w:r>
     </w:p>
@@ -3052,6 +3502,15 @@
           <w:szCs w:val="22"/>
         </w:rPr>
         <w:tab/>
+      </w:r>
+      <w:r>
+        <w:rPr>
+          <w:rFonts w:ascii="Times New Roman" w:hAnsi="Times New Roman" w:eastAsia="Times New Roman" w:cs="Times New Roman"/>
+          <w:b/>
+          <w:bCs/>
+          <w:sz w:val="22"/>
+          <w:szCs w:val="22"/>
+        </w:rPr>
         <w:t>27</w:t>
       </w:r>
     </w:p>
@@ -3082,6 +3541,15 @@
           <w:szCs w:val="22"/>
         </w:rPr>
         <w:tab/>
+      </w:r>
+      <w:r>
+        <w:rPr>
+          <w:rFonts w:ascii="Times New Roman" w:hAnsi="Times New Roman" w:eastAsia="Times New Roman" w:cs="Times New Roman"/>
+          <w:b/>
+          <w:bCs/>
+          <w:sz w:val="22"/>
+          <w:szCs w:val="22"/>
+        </w:rPr>
         <w:t>29</w:t>
       </w:r>
     </w:p>
@@ -3112,6 +3580,15 @@
           <w:szCs w:val="22"/>
         </w:rPr>
         <w:tab/>
+      </w:r>
+      <w:r>
+        <w:rPr>
+          <w:rFonts w:ascii="Times New Roman" w:hAnsi="Times New Roman" w:eastAsia="Times New Roman" w:cs="Times New Roman"/>
+          <w:b/>
+          <w:bCs/>
+          <w:sz w:val="22"/>
+          <w:szCs w:val="22"/>
+        </w:rPr>
         <w:t>30</w:t>
       </w:r>
     </w:p>
@@ -3163,6 +3640,13 @@
           <w:szCs w:val="22"/>
         </w:rPr>
         <w:tab/>
+      </w:r>
+      <w:r>
+        <w:rPr>
+          <w:rFonts w:ascii="Times New Roman" w:hAnsi="Times New Roman" w:eastAsia="Times New Roman" w:cs="Times New Roman"/>
+          <w:sz w:val="22"/>
+          <w:szCs w:val="22"/>
+        </w:rPr>
         <w:t>9</w:t>
       </w:r>
     </w:p>
@@ -3188,6 +3672,13 @@
           <w:szCs w:val="22"/>
         </w:rPr>
         <w:tab/>
+      </w:r>
+      <w:r>
+        <w:rPr>
+          <w:rFonts w:ascii="Times New Roman" w:hAnsi="Times New Roman" w:eastAsia="Times New Roman" w:cs="Times New Roman"/>
+          <w:sz w:val="22"/>
+          <w:szCs w:val="22"/>
+        </w:rPr>
         <w:t>10</w:t>
       </w:r>
     </w:p>
@@ -3213,6 +3704,13 @@
           <w:szCs w:val="22"/>
         </w:rPr>
         <w:tab/>
+      </w:r>
+      <w:r>
+        <w:rPr>
+          <w:rFonts w:ascii="Times New Roman" w:hAnsi="Times New Roman" w:eastAsia="Times New Roman" w:cs="Times New Roman"/>
+          <w:sz w:val="22"/>
+          <w:szCs w:val="22"/>
+        </w:rPr>
         <w:t>8</w:t>
       </w:r>
     </w:p>
@@ -3238,6 +3736,13 @@
           <w:szCs w:val="22"/>
         </w:rPr>
         <w:tab/>
+      </w:r>
+      <w:r>
+        <w:rPr>
+          <w:rFonts w:ascii="Times New Roman" w:hAnsi="Times New Roman" w:eastAsia="Times New Roman" w:cs="Times New Roman"/>
+          <w:sz w:val="22"/>
+          <w:szCs w:val="22"/>
+        </w:rPr>
         <w:t>13</w:t>
       </w:r>
     </w:p>
@@ -3263,6 +3768,13 @@
           <w:szCs w:val="22"/>
         </w:rPr>
         <w:tab/>
+      </w:r>
+      <w:r>
+        <w:rPr>
+          <w:rFonts w:ascii="Times New Roman" w:hAnsi="Times New Roman" w:eastAsia="Times New Roman" w:cs="Times New Roman"/>
+          <w:sz w:val="22"/>
+          <w:szCs w:val="22"/>
+        </w:rPr>
         <w:t>14</w:t>
       </w:r>
     </w:p>
@@ -3288,6 +3800,13 @@
           <w:szCs w:val="22"/>
         </w:rPr>
         <w:tab/>
+      </w:r>
+      <w:r>
+        <w:rPr>
+          <w:rFonts w:ascii="Times New Roman" w:hAnsi="Times New Roman" w:eastAsia="Times New Roman" w:cs="Times New Roman"/>
+          <w:sz w:val="22"/>
+          <w:szCs w:val="22"/>
+        </w:rPr>
         <w:t>17</w:t>
       </w:r>
     </w:p>
@@ -3313,6 +3832,13 @@
           <w:szCs w:val="22"/>
         </w:rPr>
         <w:tab/>
+      </w:r>
+      <w:r>
+        <w:rPr>
+          <w:rFonts w:ascii="Times New Roman" w:hAnsi="Times New Roman" w:eastAsia="Times New Roman" w:cs="Times New Roman"/>
+          <w:sz w:val="22"/>
+          <w:szCs w:val="22"/>
+        </w:rPr>
         <w:t>18</w:t>
       </w:r>
     </w:p>
@@ -3338,6 +3864,13 @@
           <w:szCs w:val="22"/>
         </w:rPr>
         <w:tab/>
+      </w:r>
+      <w:r>
+        <w:rPr>
+          <w:rFonts w:ascii="Times New Roman" w:hAnsi="Times New Roman" w:eastAsia="Times New Roman" w:cs="Times New Roman"/>
+          <w:sz w:val="22"/>
+          <w:szCs w:val="22"/>
+        </w:rPr>
         <w:t>18</w:t>
       </w:r>
     </w:p>
@@ -3363,6 +3896,13 @@
           <w:szCs w:val="22"/>
         </w:rPr>
         <w:tab/>
+      </w:r>
+      <w:r>
+        <w:rPr>
+          <w:rFonts w:ascii="Times New Roman" w:hAnsi="Times New Roman" w:eastAsia="Times New Roman" w:cs="Times New Roman"/>
+          <w:sz w:val="22"/>
+          <w:szCs w:val="22"/>
+        </w:rPr>
         <w:t>19</w:t>
       </w:r>
     </w:p>
@@ -3388,6 +3928,13 @@
           <w:szCs w:val="22"/>
         </w:rPr>
         <w:tab/>
+      </w:r>
+      <w:r>
+        <w:rPr>
+          <w:rFonts w:ascii="Times New Roman" w:hAnsi="Times New Roman" w:eastAsia="Times New Roman" w:cs="Times New Roman"/>
+          <w:sz w:val="22"/>
+          <w:szCs w:val="22"/>
+        </w:rPr>
         <w:t>19</w:t>
       </w:r>
     </w:p>
@@ -3413,6 +3960,13 @@
           <w:szCs w:val="22"/>
         </w:rPr>
         <w:tab/>
+      </w:r>
+      <w:r>
+        <w:rPr>
+          <w:rFonts w:ascii="Times New Roman" w:hAnsi="Times New Roman" w:eastAsia="Times New Roman" w:cs="Times New Roman"/>
+          <w:sz w:val="22"/>
+          <w:szCs w:val="22"/>
+        </w:rPr>
         <w:t>20</w:t>
       </w:r>
     </w:p>
@@ -3464,6 +4018,13 @@
           <w:szCs w:val="22"/>
         </w:rPr>
         <w:tab/>
+      </w:r>
+      <w:r>
+        <w:rPr>
+          <w:rFonts w:ascii="Times New Roman" w:hAnsi="Times New Roman" w:eastAsia="Times New Roman" w:cs="Times New Roman"/>
+          <w:sz w:val="22"/>
+          <w:szCs w:val="22"/>
+        </w:rPr>
         <w:t>7</w:t>
       </w:r>
     </w:p>
@@ -3489,6 +4050,13 @@
           <w:szCs w:val="22"/>
         </w:rPr>
         <w:tab/>
+      </w:r>
+      <w:r>
+        <w:rPr>
+          <w:rFonts w:ascii="Times New Roman" w:hAnsi="Times New Roman" w:eastAsia="Times New Roman" w:cs="Times New Roman"/>
+          <w:sz w:val="22"/>
+          <w:szCs w:val="22"/>
+        </w:rPr>
         <w:t>9</w:t>
       </w:r>
     </w:p>
@@ -3514,6 +4082,13 @@
           <w:szCs w:val="22"/>
         </w:rPr>
         <w:tab/>
+      </w:r>
+      <w:r>
+        <w:rPr>
+          <w:rFonts w:ascii="Times New Roman" w:hAnsi="Times New Roman" w:eastAsia="Times New Roman" w:cs="Times New Roman"/>
+          <w:sz w:val="22"/>
+          <w:szCs w:val="22"/>
+        </w:rPr>
         <w:t>10</w:t>
       </w:r>
     </w:p>
@@ -3539,6 +4114,13 @@
           <w:szCs w:val="22"/>
         </w:rPr>
         <w:tab/>
+      </w:r>
+      <w:r>
+        <w:rPr>
+          <w:rFonts w:ascii="Times New Roman" w:hAnsi="Times New Roman" w:eastAsia="Times New Roman" w:cs="Times New Roman"/>
+          <w:sz w:val="22"/>
+          <w:szCs w:val="22"/>
+        </w:rPr>
         <w:t>15</w:t>
       </w:r>
     </w:p>
@@ -3564,6 +4146,13 @@
           <w:szCs w:val="22"/>
         </w:rPr>
         <w:tab/>
+      </w:r>
+      <w:r>
+        <w:rPr>
+          <w:rFonts w:ascii="Times New Roman" w:hAnsi="Times New Roman" w:eastAsia="Times New Roman" w:cs="Times New Roman"/>
+          <w:sz w:val="22"/>
+          <w:szCs w:val="22"/>
+        </w:rPr>
         <w:t>21</w:t>
       </w:r>
     </w:p>
@@ -3589,6 +4178,13 @@
           <w:szCs w:val="22"/>
         </w:rPr>
         <w:tab/>
+      </w:r>
+      <w:r>
+        <w:rPr>
+          <w:rFonts w:ascii="Times New Roman" w:hAnsi="Times New Roman" w:eastAsia="Times New Roman" w:cs="Times New Roman"/>
+          <w:sz w:val="22"/>
+          <w:szCs w:val="22"/>
+        </w:rPr>
         <w:t>22</w:t>
       </w:r>
     </w:p>
@@ -3614,6 +4210,13 @@
           <w:szCs w:val="22"/>
         </w:rPr>
         <w:tab/>
+      </w:r>
+      <w:r>
+        <w:rPr>
+          <w:rFonts w:ascii="Times New Roman" w:hAnsi="Times New Roman" w:eastAsia="Times New Roman" w:cs="Times New Roman"/>
+          <w:sz w:val="22"/>
+          <w:szCs w:val="22"/>
+        </w:rPr>
         <w:t>29</w:t>
       </w:r>
     </w:p>
@@ -8179,12 +8782,38 @@
         <w:spacing w:before="160" w:after="60"/>
         <w:jc w:val="center"/>
       </w:pPr>
-      <w:r>
+    </w:p>
+    <w:p>
+      <w:pPr>
+        <w:spacing w:before="60" w:after="260"/>
+        <w:jc w:val="center"/>
+        <w:rPr>
+          <w:rFonts w:hint="default" w:ascii="Times New Roman" w:hAnsi="Times New Roman" w:eastAsia="Times New Roman" w:cs="Times New Roman"/>
+          <w:b/>
+          <w:bCs/>
+          <w:i/>
+          <w:iCs/>
+          <w:sz w:val="22"/>
+          <w:szCs w:val="22"/>
+          <w:lang w:val="en-US"/>
+        </w:rPr>
+      </w:pPr>
+      <w:r>
+        <w:rPr>
+          <w:rFonts w:hint="default" w:ascii="Times New Roman" w:hAnsi="Times New Roman" w:eastAsia="Times New Roman" w:cs="Times New Roman"/>
+          <w:b/>
+          <w:bCs/>
+          <w:i/>
+          <w:iCs/>
+          <w:sz w:val="22"/>
+          <w:szCs w:val="22"/>
+          <w:lang w:val="en-US"/>
+        </w:rPr>
         <w:drawing>
-          <wp:inline distT="0" distB="0" distL="0" distR="0">
-            <wp:extent cx="5187950" cy="3102610"/>
-            <wp:effectExtent l="0" t="0" r="6350" b="8890"/>
-            <wp:docPr id="1" name="Picture 1"/>
+          <wp:inline distT="0" distB="0" distL="114300" distR="114300">
+            <wp:extent cx="5272405" cy="3188970"/>
+            <wp:effectExtent l="0" t="0" r="10795" b="11430"/>
+            <wp:docPr id="14" name="Picture 14" descr="brave_screenshot"/>
             <wp:cNvGraphicFramePr>
               <a:graphicFrameLocks xmlns:a="http://schemas.openxmlformats.org/drawingml/2006/main" noChangeAspect="1"/>
             </wp:cNvGraphicFramePr>
@@ -8192,14 +8821,13 @@
               <a:graphicData uri="http://schemas.openxmlformats.org/drawingml/2006/picture">
                 <pic:pic xmlns:pic="http://schemas.openxmlformats.org/drawingml/2006/picture">
                   <pic:nvPicPr>
-                    <pic:cNvPr id="1" name="Picture 1"/>
+                    <pic:cNvPr id="14" name="Picture 14" descr="brave_screenshot"/>
                     <pic:cNvPicPr>
-                      <a:picLocks noChangeAspect="1" noChangeArrowheads="1"/>
+                      <a:picLocks noChangeAspect="1"/>
                     </pic:cNvPicPr>
                   </pic:nvPicPr>
                   <pic:blipFill>
                     <a:blip r:embed="rId7"/>
-                    <a:srcRect/>
                     <a:stretch>
                       <a:fillRect/>
                     </a:stretch>
@@ -8207,7 +8835,7 @@
                   <pic:spPr>
                     <a:xfrm>
                       <a:off x="0" y="0"/>
-                      <a:ext cx="5187950" cy="3102610"/>
+                      <a:ext cx="5272405" cy="3188970"/>
                     </a:xfrm>
                     <a:prstGeom prst="rect">
                       <a:avLst/>
@@ -10030,6 +10658,12 @@
             <w:insideH w:val="single" w:color="auto" w:sz="4" w:space="0"/>
             <w:insideV w:val="single" w:color="auto" w:sz="4" w:space="0"/>
           </w:tblBorders>
+          <w:tblCellMar>
+            <w:top w:w="0" w:type="dxa"/>
+            <w:left w:w="10" w:type="dxa"/>
+            <w:bottom w:w="0" w:type="dxa"/>
+            <w:right w:w="10" w:type="dxa"/>
+          </w:tblCellMar>
         </w:tblPrEx>
         <w:trPr>
           <w:tblHeader/>
@@ -11264,8 +11898,6 @@
       <w:pPr>
         <w:spacing w:before="0" w:after="160" w:line="360" w:lineRule="auto"/>
         <w:jc w:val="both"/>
-      </w:pPr>
-      <w:r>
         <w:rPr>
           <w:rFonts w:ascii="Times New Roman" w:hAnsi="Times New Roman" w:eastAsia="Times New Roman" w:cs="Times New Roman"/>
           <w:b w:val="0"/>
@@ -11276,20 +11908,36 @@
           <w:sz w:val="24"/>
           <w:szCs w:val="24"/>
         </w:rPr>
+      </w:pPr>
+      <w:r>
+        <w:rPr>
+          <w:rFonts w:ascii="Times New Roman" w:hAnsi="Times New Roman" w:eastAsia="Times New Roman" w:cs="Times New Roman"/>
+          <w:b w:val="0"/>
+          <w:bCs w:val="0"/>
+          <w:i w:val="0"/>
+          <w:iCs w:val="0"/>
+          <w:color w:val="000000"/>
+          <w:sz w:val="24"/>
+          <w:szCs w:val="24"/>
+        </w:rPr>
         <w:t>The system has been designed around established web application conventions that users already recognize. Registration takes under one minute, and all main modules are accessible directly from the dashboard without any configuration. The only requirements for use are a modern web browser and an internet connection. Operational feasibility is rated as high.</w:t>
       </w:r>
     </w:p>
     <w:p>
       <w:pPr>
-        <w:spacing w:before="160" w:after="60"/>
-        <w:jc w:val="center"/>
-      </w:pPr>
-      <w:r>
+        <w:spacing w:before="0" w:after="160" w:line="360" w:lineRule="auto"/>
+        <w:jc w:val="both"/>
+      </w:pPr>
+      <w:r>
+        <w:rPr>
+          <w:rFonts w:hint="default"/>
+          <w:lang w:val="en-US"/>
+        </w:rPr>
         <w:drawing>
-          <wp:inline distT="0" distB="0" distL="0" distR="0">
-            <wp:extent cx="4953000" cy="3552825"/>
-            <wp:effectExtent l="0" t="0" r="0" b="0"/>
-            <wp:docPr id="2" name="Picture 2"/>
+          <wp:inline distT="0" distB="0" distL="114300" distR="114300">
+            <wp:extent cx="5266055" cy="6670040"/>
+            <wp:effectExtent l="0" t="0" r="4445" b="10160"/>
+            <wp:docPr id="6" name="Picture 6" descr="Figure_3.1_UseCaseDiagram_page-0001"/>
             <wp:cNvGraphicFramePr>
               <a:graphicFrameLocks xmlns:a="http://schemas.openxmlformats.org/drawingml/2006/main" noChangeAspect="1"/>
             </wp:cNvGraphicFramePr>
@@ -11297,14 +11945,13 @@
               <a:graphicData uri="http://schemas.openxmlformats.org/drawingml/2006/picture">
                 <pic:pic xmlns:pic="http://schemas.openxmlformats.org/drawingml/2006/picture">
                   <pic:nvPicPr>
-                    <pic:cNvPr id="2" name="Picture 2"/>
+                    <pic:cNvPr id="6" name="Picture 6" descr="Figure_3.1_UseCaseDiagram_page-0001"/>
                     <pic:cNvPicPr>
-                      <a:picLocks noChangeAspect="1" noChangeArrowheads="1"/>
+                      <a:picLocks noChangeAspect="1"/>
                     </pic:cNvPicPr>
                   </pic:nvPicPr>
                   <pic:blipFill>
                     <a:blip r:embed="rId8"/>
-                    <a:srcRect/>
                     <a:stretch>
                       <a:fillRect/>
                     </a:stretch>
@@ -11312,7 +11959,7 @@
                   <pic:spPr>
                     <a:xfrm>
                       <a:off x="0" y="0"/>
-                      <a:ext cx="4953000" cy="3552825"/>
+                      <a:ext cx="5266055" cy="6670040"/>
                     </a:xfrm>
                     <a:prstGeom prst="rect">
                       <a:avLst/>
@@ -11347,13 +11994,21 @@
       <w:pPr>
         <w:spacing w:before="160" w:after="60"/>
         <w:jc w:val="center"/>
-      </w:pPr>
-      <w:r>
+        <w:rPr>
+          <w:rFonts w:hint="default"/>
+          <w:lang w:val="en-US"/>
+        </w:rPr>
+      </w:pPr>
+      <w:r>
+        <w:rPr>
+          <w:rFonts w:hint="default"/>
+          <w:lang w:val="en-US"/>
+        </w:rPr>
         <w:drawing>
-          <wp:inline distT="0" distB="0" distL="0" distR="0">
-            <wp:extent cx="4953000" cy="3543300"/>
-            <wp:effectExtent l="0" t="0" r="0" b="0"/>
-            <wp:docPr id="3" name="Picture 3"/>
+          <wp:inline distT="0" distB="0" distL="114300" distR="114300">
+            <wp:extent cx="5274310" cy="5638800"/>
+            <wp:effectExtent l="0" t="0" r="8890" b="0"/>
+            <wp:docPr id="16" name="Picture 16" descr="brave_screenshot (2)"/>
             <wp:cNvGraphicFramePr>
               <a:graphicFrameLocks xmlns:a="http://schemas.openxmlformats.org/drawingml/2006/main" noChangeAspect="1"/>
             </wp:cNvGraphicFramePr>
@@ -11361,14 +12016,13 @@
               <a:graphicData uri="http://schemas.openxmlformats.org/drawingml/2006/picture">
                 <pic:pic xmlns:pic="http://schemas.openxmlformats.org/drawingml/2006/picture">
                   <pic:nvPicPr>
-                    <pic:cNvPr id="3" name="Picture 3"/>
+                    <pic:cNvPr id="16" name="Picture 16" descr="brave_screenshot (2)"/>
                     <pic:cNvPicPr>
-                      <a:picLocks noChangeAspect="1" noChangeArrowheads="1"/>
+                      <a:picLocks noChangeAspect="1"/>
                     </pic:cNvPicPr>
                   </pic:nvPicPr>
                   <pic:blipFill>
                     <a:blip r:embed="rId9"/>
-                    <a:srcRect/>
                     <a:stretch>
                       <a:fillRect/>
                     </a:stretch>
@@ -11376,7 +12030,7 @@
                   <pic:spPr>
                     <a:xfrm>
                       <a:off x="0" y="0"/>
-                      <a:ext cx="4953000" cy="3543300"/>
+                      <a:ext cx="5274310" cy="5638800"/>
                     </a:xfrm>
                     <a:prstGeom prst="rect">
                       <a:avLst/>
@@ -11541,12 +12195,38 @@
         <w:spacing w:before="160" w:after="60"/>
         <w:jc w:val="center"/>
       </w:pPr>
-      <w:r>
+    </w:p>
+    <w:p>
+      <w:pPr>
+        <w:spacing w:before="60" w:after="260"/>
+        <w:jc w:val="center"/>
+        <w:rPr>
+          <w:rFonts w:hint="default" w:ascii="Times New Roman" w:hAnsi="Times New Roman" w:eastAsia="Times New Roman" w:cs="Times New Roman"/>
+          <w:b/>
+          <w:bCs/>
+          <w:i/>
+          <w:iCs/>
+          <w:sz w:val="22"/>
+          <w:szCs w:val="22"/>
+          <w:lang w:val="en-US"/>
+        </w:rPr>
+      </w:pPr>
+      <w:r>
+        <w:rPr>
+          <w:rFonts w:hint="default" w:ascii="Times New Roman" w:hAnsi="Times New Roman" w:eastAsia="Times New Roman" w:cs="Times New Roman"/>
+          <w:b/>
+          <w:bCs/>
+          <w:i/>
+          <w:iCs/>
+          <w:sz w:val="22"/>
+          <w:szCs w:val="22"/>
+          <w:lang w:val="en-US"/>
+        </w:rPr>
         <w:drawing>
-          <wp:inline distT="0" distB="0" distL="0" distR="0">
-            <wp:extent cx="4095750" cy="4400550"/>
-            <wp:effectExtent l="0" t="0" r="0" b="0"/>
-            <wp:docPr id="4" name="Picture 4"/>
+          <wp:inline distT="0" distB="0" distL="114300" distR="114300">
+            <wp:extent cx="6097905" cy="5427980"/>
+            <wp:effectExtent l="0" t="0" r="10795" b="7620"/>
+            <wp:docPr id="15" name="Picture 15" descr="brave_screenshot (1)"/>
             <wp:cNvGraphicFramePr>
               <a:graphicFrameLocks xmlns:a="http://schemas.openxmlformats.org/drawingml/2006/main" noChangeAspect="1"/>
             </wp:cNvGraphicFramePr>
@@ -11554,14 +12234,13 @@
               <a:graphicData uri="http://schemas.openxmlformats.org/drawingml/2006/picture">
                 <pic:pic xmlns:pic="http://schemas.openxmlformats.org/drawingml/2006/picture">
                   <pic:nvPicPr>
-                    <pic:cNvPr id="4" name="Picture 4"/>
+                    <pic:cNvPr id="15" name="Picture 15" descr="brave_screenshot (1)"/>
                     <pic:cNvPicPr>
-                      <a:picLocks noChangeAspect="1" noChangeArrowheads="1"/>
+                      <a:picLocks noChangeAspect="1"/>
                     </pic:cNvPicPr>
                   </pic:nvPicPr>
                   <pic:blipFill>
                     <a:blip r:embed="rId10"/>
-                    <a:srcRect/>
                     <a:stretch>
                       <a:fillRect/>
                     </a:stretch>
@@ -11569,7 +12248,7 @@
                   <pic:spPr>
                     <a:xfrm>
                       <a:off x="0" y="0"/>
-                      <a:ext cx="4095750" cy="4400550"/>
+                      <a:ext cx="6097905" cy="5427980"/>
                     </a:xfrm>
                     <a:prstGeom prst="rect">
                       <a:avLst/>
@@ -11642,12 +12321,28 @@
         <w:spacing w:before="160" w:after="60"/>
         <w:jc w:val="center"/>
       </w:pPr>
-      <w:r>
+      <w:bookmarkStart w:id="0" w:name="_GoBack"/>
+      <w:bookmarkEnd w:id="0"/>
+    </w:p>
+    <w:p>
+      <w:pPr>
+        <w:spacing w:before="160" w:after="60"/>
+        <w:jc w:val="center"/>
+        <w:rPr>
+          <w:rFonts w:hint="default"/>
+          <w:lang w:val="en-US"/>
+        </w:rPr>
+      </w:pPr>
+      <w:r>
+        <w:rPr>
+          <w:rFonts w:hint="default"/>
+          <w:lang w:val="en-US"/>
+        </w:rPr>
         <w:drawing>
-          <wp:inline distT="0" distB="0" distL="0" distR="0">
-            <wp:extent cx="5048250" cy="3571875"/>
-            <wp:effectExtent l="0" t="0" r="0" b="0"/>
-            <wp:docPr id="5" name="Picture 5"/>
+          <wp:inline distT="0" distB="0" distL="114300" distR="114300">
+            <wp:extent cx="5271770" cy="5207000"/>
+            <wp:effectExtent l="0" t="0" r="11430" b="0"/>
+            <wp:docPr id="3" name="Picture 3" descr="brave_screenshot (3)"/>
             <wp:cNvGraphicFramePr>
               <a:graphicFrameLocks xmlns:a="http://schemas.openxmlformats.org/drawingml/2006/main" noChangeAspect="1"/>
             </wp:cNvGraphicFramePr>
@@ -11655,14 +12350,13 @@
               <a:graphicData uri="http://schemas.openxmlformats.org/drawingml/2006/picture">
                 <pic:pic xmlns:pic="http://schemas.openxmlformats.org/drawingml/2006/picture">
                   <pic:nvPicPr>
-                    <pic:cNvPr id="5" name="Picture 5"/>
+                    <pic:cNvPr id="3" name="Picture 3" descr="brave_screenshot (3)"/>
                     <pic:cNvPicPr>
-                      <a:picLocks noChangeAspect="1" noChangeArrowheads="1"/>
+                      <a:picLocks noChangeAspect="1"/>
                     </pic:cNvPicPr>
                   </pic:nvPicPr>
                   <pic:blipFill>
                     <a:blip r:embed="rId11"/>
-                    <a:srcRect/>
                     <a:stretch>
                       <a:fillRect/>
                     </a:stretch>
@@ -11670,7 +12364,7 @@
                   <pic:spPr>
                     <a:xfrm>
                       <a:off x="0" y="0"/>
-                      <a:ext cx="5048250" cy="3571875"/>
+                      <a:ext cx="5271770" cy="5207000"/>
                     </a:xfrm>
                     <a:prstGeom prst="rect">
                       <a:avLst/>
@@ -13180,8 +13874,6 @@
           </wp:inline>
         </w:drawing>
       </w:r>
-      <w:bookmarkStart w:id="0" w:name="_GoBack"/>
-      <w:bookmarkEnd w:id="0"/>
       <w:r>
         <w:rPr>
           <w:rFonts w:ascii="Times New Roman" w:hAnsi="Times New Roman" w:eastAsia="Times New Roman" w:cs="Times New Roman"/>
@@ -15594,6 +16286,14 @@
       </w:tblGrid>
       <w:tr>
         <w:tblPrEx>
+          <w:tblBorders>
+            <w:top w:val="single" w:color="auto" w:sz="4" w:space="0"/>
+            <w:left w:val="single" w:color="auto" w:sz="4" w:space="0"/>
+            <w:bottom w:val="single" w:color="auto" w:sz="4" w:space="0"/>
+            <w:right w:val="single" w:color="auto" w:sz="4" w:space="0"/>
+            <w:insideH w:val="single" w:color="auto" w:sz="4" w:space="0"/>
+            <w:insideV w:val="single" w:color="auto" w:sz="4" w:space="0"/>
+          </w:tblBorders>
           <w:tblCellMar>
             <w:top w:w="0" w:type="dxa"/>
             <w:left w:w="10" w:type="dxa"/>
@@ -18878,8 +19578,8 @@
     <w:lsdException w:unhideWhenUsed="0" w:uiPriority="0" w:semiHidden="0" w:name="annotation reference"/>
     <w:lsdException w:unhideWhenUsed="0" w:uiPriority="0" w:semiHidden="0" w:name="line number"/>
     <w:lsdException w:unhideWhenUsed="0" w:uiPriority="0" w:semiHidden="0" w:name="page number"/>
-    <w:lsdException w:uiPriority="99" w:name="endnote reference"/>
-    <w:lsdException w:uiPriority="99" w:name="endnote text"/>
+    <w:lsdException w:qFormat="1" w:uiPriority="99" w:name="endnote reference"/>
+    <w:lsdException w:qFormat="1" w:uiPriority="99" w:name="endnote text"/>
     <w:lsdException w:unhideWhenUsed="0" w:uiPriority="0" w:semiHidden="0" w:name="table of authorities"/>
     <w:lsdException w:unhideWhenUsed="0" w:uiPriority="0" w:semiHidden="0" w:name="macro"/>
     <w:lsdException w:unhideWhenUsed="0" w:uiPriority="0" w:semiHidden="0" w:name="toa heading"/>
@@ -19214,6 +19914,7 @@
     <w:name w:val="endnote reference"/>
     <w:semiHidden/>
     <w:unhideWhenUsed/>
+    <w:qFormat/>
     <w:uiPriority w:val="99"/>
     <w:rPr>
       <w:vertAlign w:val="superscript"/>
@@ -19224,6 +19925,7 @@
     <w:link w:val="18"/>
     <w:semiHidden/>
     <w:unhideWhenUsed/>
+    <w:qFormat/>
     <w:uiPriority w:val="99"/>
     <w:pPr>
       <w:spacing w:after="0" w:line="240" w:lineRule="auto"/>

</xml_diff>